<commit_message>
docs(help-bot): company signup knowledge, HR manual and quick check
Co-Authored-By: Claude Sonnet 5.5 <noreply@anthropic.com>
</commit_message>
<xml_diff>
--- a/docs/Smile-Recruitment-Portal-User-Manual-HR.docx
+++ b/docs/Smile-Recruitment-Portal-User-Manual-HR.docx
@@ -44,6 +44,25 @@
           <w:rFonts w:ascii="Calibri" w:cs="Calibri" w:eastAsia="Calibri" w:hAnsi="Calibri"/>
         </w:rPr>
         <w:t xml:space="preserve">A short, step-by-step guide to the portal from first sign-in to the final interview. No technical knowledge needed.</w:t>
+      </w:r>
+    </w:p>
+    <w:p>
+      <w:pPr>
+        <w:spacing w:after="100" w:line="276"/>
+      </w:pPr>
+      <w:r>
+        <w:rPr>
+          <w:rFonts w:ascii="Calibri" w:cs="Calibri" w:eastAsia="Calibri" w:hAnsi="Calibri"/>
+          <w:b/>
+          <w:bCs/>
+        </w:rPr>
+        <w:t xml:space="preserve">Portal address:</w:t>
+      </w:r>
+      <w:r>
+        <w:rPr>
+          <w:rFonts w:ascii="Calibri" w:cs="Calibri" w:eastAsia="Calibri" w:hAnsi="Calibri"/>
+        </w:rPr>
+        <w:t xml:space="preserve"> https://smile.mclinkgroup.com</w:t>
       </w:r>
     </w:p>
     <w:p>
@@ -632,7 +651,21 @@
         <w:rPr>
           <w:rFonts w:ascii="Calibri" w:cs="Calibri" w:eastAsia="Calibri" w:hAnsi="Calibri"/>
         </w:rPr>
-        <w:t xml:space="preserve">Open the portal and choose </w:t>
+        <w:t xml:space="preserve">Open </w:t>
+      </w:r>
+      <w:r>
+        <w:rPr>
+          <w:rFonts w:ascii="Calibri" w:cs="Calibri" w:eastAsia="Calibri" w:hAnsi="Calibri"/>
+          <w:b/>
+          <w:bCs/>
+        </w:rPr>
+        <w:t xml:space="preserve">https://smile.mclinkgroup.com</w:t>
+      </w:r>
+      <w:r>
+        <w:rPr>
+          <w:rFonts w:ascii="Calibri" w:cs="Calibri" w:eastAsia="Calibri" w:hAnsi="Calibri"/>
+        </w:rPr>
+        <w:t xml:space="preserve"> in your browser and choose </w:t>
       </w:r>
       <w:r>
         <w:rPr>
@@ -1127,7 +1160,7 @@
         <w:rPr>
           <w:rFonts w:ascii="Calibri" w:cs="Calibri" w:eastAsia="Calibri" w:hAnsi="Calibri"/>
         </w:rPr>
-        <w:t xml:space="preserve">Upload the job description (PDF, DOC or DOCX) or paste the text, then choose </w:t>
+        <w:t xml:space="preserve">Under </w:t>
       </w:r>
       <w:r>
         <w:rPr>
@@ -1141,7 +1174,21 @@
         <w:rPr>
           <w:rFonts w:ascii="Calibri" w:cs="Calibri" w:eastAsia="Calibri" w:hAnsi="Calibri"/>
         </w:rPr>
-        <w:t xml:space="preserve">. Smile fills in the details, screening criteria and interview questions.</w:t>
+        <w:t xml:space="preserve">, upload the job description (PDF, DOC or DOCX) or paste the text, then click </w:t>
+      </w:r>
+      <w:r>
+        <w:rPr>
+          <w:rFonts w:ascii="Calibri" w:cs="Calibri" w:eastAsia="Calibri" w:hAnsi="Calibri"/>
+          <w:b/>
+          <w:bCs/>
+        </w:rPr>
+        <w:t xml:space="preserve">Generate draft</w:t>
+      </w:r>
+      <w:r>
+        <w:rPr>
+          <w:rFonts w:ascii="Calibri" w:cs="Calibri" w:eastAsia="Calibri" w:hAnsi="Calibri"/>
+        </w:rPr>
+        <w:t xml:space="preserve">. Smile fills in the role details, screening criteria and interview questions for you.</w:t>
       </w:r>
     </w:p>
     <w:p>
@@ -1310,13 +1357,37 @@
           <w:b/>
           <w:bCs/>
         </w:rPr>
-        <w:t xml:space="preserve">Resume Screening.</w:t>
-      </w:r>
-      <w:r>
-        <w:rPr>
-          <w:rFonts w:ascii="Calibri" w:cs="Calibri" w:eastAsia="Calibri" w:hAnsi="Calibri"/>
-        </w:rPr>
-        <w:t xml:space="preserve"> Upload a batch of resumes from your computer, Google Drive or OneDrive for one published role.</w:t>
+        <w:t xml:space="preserve">Batch resume screening.</w:t>
+      </w:r>
+      <w:r>
+        <w:rPr>
+          <w:rFonts w:ascii="Calibri" w:cs="Calibri" w:eastAsia="Calibri" w:hAnsi="Calibri"/>
+        </w:rPr>
+        <w:t xml:space="preserve"> Open Resume Screening, choose a published role and upload many resumes at once from your computer or Google Drive.</w:t>
+      </w:r>
+    </w:p>
+    <w:p>
+      <w:pPr>
+        <w:pStyle w:val="ListParagraph"/>
+        <w:numPr>
+          <w:ilvl w:val="0"/>
+          <w:numId w:val="5"/>
+        </w:numPr>
+        <w:spacing w:after="60" w:line="276"/>
+      </w:pPr>
+      <w:r>
+        <w:rPr>
+          <w:rFonts w:ascii="Calibri" w:cs="Calibri" w:eastAsia="Calibri" w:hAnsi="Calibri"/>
+          <w:b/>
+          <w:bCs/>
+        </w:rPr>
+        <w:t xml:space="preserve">Screen one resume.</w:t>
+      </w:r>
+      <w:r>
+        <w:rPr>
+          <w:rFonts w:ascii="Calibri" w:cs="Calibri" w:eastAsia="Calibri" w:hAnsi="Calibri"/>
+        </w:rPr>
+        <w:t xml:space="preserve"> On the Resume Screening page, scroll to Screen one resume. Choose the role, enter the candidate's details, attach one resume and choose Screen resume.</w:t>
       </w:r>
     </w:p>
     <w:p>
@@ -2219,21 +2290,7 @@
         <w:rPr>
           <w:rFonts w:ascii="Calibri" w:cs="Calibri" w:eastAsia="Calibri" w:hAnsi="Calibri"/>
         </w:rPr>
-        <w:t xml:space="preserve"> 2,000 credits) or type your own amount from 1 to 10,000 credits, then pay with HitPay. Each credit costs </w:t>
-      </w:r>
-      <w:r>
-        <w:rPr>
-          <w:rFonts w:ascii="Calibri" w:cs="Calibri" w:eastAsia="Calibri" w:hAnsi="Calibri"/>
-          <w:b/>
-          <w:bCs/>
-        </w:rPr>
-        <w:t xml:space="preserve">S$0.40</w:t>
-      </w:r>
-      <w:r>
-        <w:rPr>
-          <w:rFonts w:ascii="Calibri" w:cs="Calibri" w:eastAsia="Calibri" w:hAnsi="Calibri"/>
-        </w:rPr>
-        <w:t xml:space="preserve">, so 25 credits is S$10.00. Buy </w:t>
+        <w:t xml:space="preserve"> 2,000 credits) or type your own amount from 1 to 10,000 credits, then pay with HitPay. The price per credit is shown on the Credits page, and the total updates as you type. Buy </w:t>
       </w:r>
       <w:r>
         <w:rPr>
@@ -2273,6 +2330,44 @@
           <w:rFonts w:ascii="Calibri" w:cs="Calibri" w:eastAsia="Calibri" w:hAnsi="Calibri"/>
         </w:rPr>
         <w:t xml:space="preserve">When credits run low the Dashboard warns you. If they run out, resume screening and interviews pause until you add more.</w:t>
+      </w:r>
+    </w:p>
+    <w:p>
+      <w:pPr>
+        <w:pBdr>
+          <w:left w:val="single" w:color="0E4471" w:sz="18" w:space="8"/>
+        </w:pBdr>
+        <w:shd w:fill="EAF1F8" w:val="clear"/>
+        <w:spacing w:after="140" w:before="80"/>
+        <w:ind w:left="120"/>
+      </w:pPr>
+      <w:r>
+        <w:rPr>
+          <w:rFonts w:ascii="Calibri" w:cs="Calibri" w:eastAsia="Calibri" w:hAnsi="Calibri"/>
+          <w:b/>
+          <w:bCs/>
+        </w:rPr>
+        <w:t xml:space="preserve">Testing payments?</w:t>
+      </w:r>
+      <w:r>
+        <w:rPr>
+          <w:rFonts w:ascii="Calibri" w:cs="Calibri" w:eastAsia="Calibri" w:hAnsi="Calibri"/>
+        </w:rPr>
+        <w:t xml:space="preserve"> Buy only </w:t>
+      </w:r>
+      <w:r>
+        <w:rPr>
+          <w:rFonts w:ascii="Calibri" w:cs="Calibri" w:eastAsia="Calibri" w:hAnsi="Calibri"/>
+          <w:b/>
+          <w:bCs/>
+        </w:rPr>
+        <w:t xml:space="preserve">2 credits</w:t>
+      </w:r>
+      <w:r>
+        <w:rPr>
+          <w:rFonts w:ascii="Calibri" w:cs="Calibri" w:eastAsia="Calibri" w:hAnsi="Calibri"/>
+        </w:rPr>
+        <w:t xml:space="preserve"> (type 2 in the custom amount box). Payments are charged to the real account, so keep test purchases as small as possible.</w:t>
       </w:r>
     </w:p>
     <w:p>
@@ -2290,353 +2385,8 @@
           <w:sz w:val="30"/>
           <w:szCs w:val="30"/>
         </w:rPr>
-        <w:t xml:space="preserve">Common questions</w:t>
-      </w:r>
-    </w:p>
-    <w:tbl>
-      <w:tblPr>
-        <w:tblW w:type="dxa" w:w="9000"/>
-        <w:tblBorders>
-          <w:top w:val="single" w:color="auto" w:sz="4"/>
-          <w:left w:val="single" w:color="auto" w:sz="4"/>
-          <w:bottom w:val="single" w:color="auto" w:sz="4"/>
-          <w:right w:val="single" w:color="auto" w:sz="4"/>
-          <w:insideH w:val="single" w:color="auto" w:sz="4"/>
-          <w:insideV w:val="single" w:color="auto" w:sz="4"/>
-        </w:tblBorders>
-      </w:tblPr>
-      <w:tblGrid>
-        <w:gridCol w:w="3200"/>
-        <w:gridCol w:w="5800"/>
-      </w:tblGrid>
-      <w:tr>
-        <w:trPr>
-          <w:tblHeader/>
-        </w:trPr>
-        <w:tc>
-          <w:tcPr>
-            <w:tcW w:type="dxa" w:w="3200"/>
-            <w:shd w:fill="17324D" w:val="clear"/>
-            <w:tcMar>
-              <w:top w:type="dxa" w:w="70"/>
-              <w:left w:type="dxa" w:w="110"/>
-              <w:bottom w:type="dxa" w:w="70"/>
-              <w:right w:type="dxa" w:w="110"/>
-            </w:tcMar>
-          </w:tcPr>
-          <w:p>
-            <w:r>
-              <w:rPr>
-                <w:rFonts w:ascii="Calibri" w:cs="Calibri" w:eastAsia="Calibri" w:hAnsi="Calibri"/>
-                <w:b/>
-                <w:bCs/>
-                <w:color w:val="FFFFFF"/>
-              </w:rPr>
-              <w:t xml:space="preserve">If you see…</w:t>
-            </w:r>
-          </w:p>
-        </w:tc>
-        <w:tc>
-          <w:tcPr>
-            <w:tcW w:type="dxa" w:w="5800"/>
-            <w:shd w:fill="17324D" w:val="clear"/>
-            <w:tcMar>
-              <w:top w:type="dxa" w:w="70"/>
-              <w:left w:type="dxa" w:w="110"/>
-              <w:bottom w:type="dxa" w:w="70"/>
-              <w:right w:type="dxa" w:w="110"/>
-            </w:tcMar>
-          </w:tcPr>
-          <w:p>
-            <w:r>
-              <w:rPr>
-                <w:rFonts w:ascii="Calibri" w:cs="Calibri" w:eastAsia="Calibri" w:hAnsi="Calibri"/>
-                <w:b/>
-                <w:bCs/>
-                <w:color w:val="FFFFFF"/>
-              </w:rPr>
-              <w:t xml:space="preserve">Do this</w:t>
-            </w:r>
-          </w:p>
-        </w:tc>
-      </w:tr>
-      <w:tr>
-        <w:trPr>
-          <w:cantSplit/>
-        </w:trPr>
-        <w:tc>
-          <w:tcPr>
-            <w:tcW w:type="dxa" w:w="3200"/>
-            <w:tcMar>
-              <w:top w:type="dxa" w:w="70"/>
-              <w:left w:type="dxa" w:w="110"/>
-              <w:bottom w:type="dxa" w:w="70"/>
-              <w:right w:type="dxa" w:w="110"/>
-            </w:tcMar>
-          </w:tcPr>
-          <w:p>
-            <w:r>
-              <w:rPr>
-                <w:rFonts w:ascii="Calibri" w:cs="Calibri" w:eastAsia="Calibri" w:hAnsi="Calibri"/>
-              </w:rPr>
-              <w:t xml:space="preserve">A menu item is missing</w:t>
-            </w:r>
-          </w:p>
-        </w:tc>
-        <w:tc>
-          <w:tcPr>
-            <w:tcW w:type="dxa" w:w="5800"/>
-            <w:tcMar>
-              <w:top w:type="dxa" w:w="70"/>
-              <w:left w:type="dxa" w:w="110"/>
-              <w:bottom w:type="dxa" w:w="70"/>
-              <w:right w:type="dxa" w:w="110"/>
-            </w:tcMar>
-          </w:tcPr>
-          <w:p>
-            <w:r>
-              <w:rPr>
-                <w:rFonts w:ascii="Calibri" w:cs="Calibri" w:eastAsia="Calibri" w:hAnsi="Calibri"/>
-              </w:rPr>
-              <w:t xml:space="preserve">Your access does not include it. Ask HR or your organization owner.</w:t>
-            </w:r>
-          </w:p>
-        </w:tc>
-      </w:tr>
-      <w:tr>
-        <w:trPr>
-          <w:cantSplit/>
-        </w:trPr>
-        <w:tc>
-          <w:tcPr>
-            <w:tcW w:type="dxa" w:w="3200"/>
-            <w:tcMar>
-              <w:top w:type="dxa" w:w="70"/>
-              <w:left w:type="dxa" w:w="110"/>
-              <w:bottom w:type="dxa" w:w="70"/>
-              <w:right w:type="dxa" w:w="110"/>
-            </w:tcMar>
-          </w:tcPr>
-          <w:p>
-            <w:r>
-              <w:rPr>
-                <w:rFonts w:ascii="Calibri" w:cs="Calibri" w:eastAsia="Calibri" w:hAnsi="Calibri"/>
-              </w:rPr>
-              <w:t xml:space="preserve">Limited access after sign-in</w:t>
-            </w:r>
-          </w:p>
-        </w:tc>
-        <w:tc>
-          <w:tcPr>
-            <w:tcW w:type="dxa" w:w="5800"/>
-            <w:tcMar>
-              <w:top w:type="dxa" w:w="70"/>
-              <w:left w:type="dxa" w:w="110"/>
-              <w:bottom w:type="dxa" w:w="70"/>
-              <w:right w:type="dxa" w:w="110"/>
-            </w:tcMar>
-          </w:tcPr>
-          <w:p>
-            <w:r>
-              <w:rPr>
-                <w:rFonts w:ascii="Calibri" w:cs="Calibri" w:eastAsia="Calibri" w:hAnsi="Calibri"/>
-              </w:rPr>
-              <w:t xml:space="preserve">Your account has no recruitment permissions yet. Contact HR.</w:t>
-            </w:r>
-          </w:p>
-        </w:tc>
-      </w:tr>
-      <w:tr>
-        <w:trPr>
-          <w:cantSplit/>
-        </w:trPr>
-        <w:tc>
-          <w:tcPr>
-            <w:tcW w:type="dxa" w:w="3200"/>
-            <w:tcMar>
-              <w:top w:type="dxa" w:w="70"/>
-              <w:left w:type="dxa" w:w="110"/>
-              <w:bottom w:type="dxa" w:w="70"/>
-              <w:right w:type="dxa" w:w="110"/>
-            </w:tcMar>
-          </w:tcPr>
-          <w:p>
-            <w:r>
-              <w:rPr>
-                <w:rFonts w:ascii="Calibri" w:cs="Calibri" w:eastAsia="Calibri" w:hAnsi="Calibri"/>
-              </w:rPr>
-              <w:t xml:space="preserve">Verify your email</w:t>
-            </w:r>
-          </w:p>
-        </w:tc>
-        <w:tc>
-          <w:tcPr>
-            <w:tcW w:type="dxa" w:w="5800"/>
-            <w:tcMar>
-              <w:top w:type="dxa" w:w="70"/>
-              <w:left w:type="dxa" w:w="110"/>
-              <w:bottom w:type="dxa" w:w="70"/>
-              <w:right w:type="dxa" w:w="110"/>
-            </w:tcMar>
-          </w:tcPr>
-          <w:p>
-            <w:r>
-              <w:rPr>
-                <w:rFonts w:ascii="Calibri" w:cs="Calibri" w:eastAsia="Calibri" w:hAnsi="Calibri"/>
-              </w:rPr>
-              <w:t xml:space="preserve">Choose </w:t>
-            </w:r>
-            <w:r>
-              <w:rPr>
-                <w:rFonts w:ascii="Calibri" w:cs="Calibri" w:eastAsia="Calibri" w:hAnsi="Calibri"/>
-                <w:b/>
-                <w:bCs/>
-              </w:rPr>
-              <w:t xml:space="preserve">Resend verification email</w:t>
-            </w:r>
-            <w:r>
-              <w:rPr>
-                <w:rFonts w:ascii="Calibri" w:cs="Calibri" w:eastAsia="Calibri" w:hAnsi="Calibri"/>
-              </w:rPr>
-              <w:t xml:space="preserve"> and use the newest link.</w:t>
-            </w:r>
-          </w:p>
-        </w:tc>
-      </w:tr>
-      <w:tr>
-        <w:trPr>
-          <w:cantSplit/>
-        </w:trPr>
-        <w:tc>
-          <w:tcPr>
-            <w:tcW w:type="dxa" w:w="3200"/>
-            <w:tcMar>
-              <w:top w:type="dxa" w:w="70"/>
-              <w:left w:type="dxa" w:w="110"/>
-              <w:bottom w:type="dxa" w:w="70"/>
-              <w:right w:type="dxa" w:w="110"/>
-            </w:tcMar>
-          </w:tcPr>
-          <w:p>
-            <w:r>
-              <w:rPr>
-                <w:rFonts w:ascii="Calibri" w:cs="Calibri" w:eastAsia="Calibri" w:hAnsi="Calibri"/>
-              </w:rPr>
-              <w:t xml:space="preserve">Organization has reached its limit</w:t>
-            </w:r>
-          </w:p>
-        </w:tc>
-        <w:tc>
-          <w:tcPr>
-            <w:tcW w:type="dxa" w:w="5800"/>
-            <w:tcMar>
-              <w:top w:type="dxa" w:w="70"/>
-              <w:left w:type="dxa" w:w="110"/>
-              <w:bottom w:type="dxa" w:w="70"/>
-              <w:right w:type="dxa" w:w="110"/>
-            </w:tcMar>
-          </w:tcPr>
-          <w:p>
-            <w:r>
-              <w:rPr>
-                <w:rFonts w:ascii="Calibri" w:cs="Calibri" w:eastAsia="Calibri" w:hAnsi="Calibri"/>
-              </w:rPr>
-              <w:t xml:space="preserve">Ask your owner or McLink support to raise the people limit.</w:t>
-            </w:r>
-          </w:p>
-        </w:tc>
-      </w:tr>
-      <w:tr>
-        <w:trPr>
-          <w:cantSplit/>
-        </w:trPr>
-        <w:tc>
-          <w:tcPr>
-            <w:tcW w:type="dxa" w:w="3200"/>
-            <w:tcMar>
-              <w:top w:type="dxa" w:w="70"/>
-              <w:left w:type="dxa" w:w="110"/>
-              <w:bottom w:type="dxa" w:w="70"/>
-              <w:right w:type="dxa" w:w="110"/>
-            </w:tcMar>
-          </w:tcPr>
-          <w:p>
-            <w:r>
-              <w:rPr>
-                <w:rFonts w:ascii="Calibri" w:cs="Calibri" w:eastAsia="Calibri" w:hAnsi="Calibri"/>
-              </w:rPr>
-              <w:t xml:space="preserve">Someone else changed the record</w:t>
-            </w:r>
-          </w:p>
-        </w:tc>
-        <w:tc>
-          <w:tcPr>
-            <w:tcW w:type="dxa" w:w="5800"/>
-            <w:tcMar>
-              <w:top w:type="dxa" w:w="70"/>
-              <w:left w:type="dxa" w:w="110"/>
-              <w:bottom w:type="dxa" w:w="70"/>
-              <w:right w:type="dxa" w:w="110"/>
-            </w:tcMar>
-          </w:tcPr>
-          <w:p>
-            <w:r>
-              <w:rPr>
-                <w:rFonts w:ascii="Calibri" w:cs="Calibri" w:eastAsia="Calibri" w:hAnsi="Calibri"/>
-              </w:rPr>
-              <w:t xml:space="preserve">Refresh the page and try again.</w:t>
-            </w:r>
-          </w:p>
-        </w:tc>
-      </w:tr>
-      <w:tr>
-        <w:trPr>
-          <w:cantSplit/>
-        </w:trPr>
-        <w:tc>
-          <w:tcPr>
-            <w:tcW w:type="dxa" w:w="3200"/>
-            <w:tcMar>
-              <w:top w:type="dxa" w:w="70"/>
-              <w:left w:type="dxa" w:w="110"/>
-              <w:bottom w:type="dxa" w:w="70"/>
-              <w:right w:type="dxa" w:w="110"/>
-            </w:tcMar>
-          </w:tcPr>
-          <w:p>
-            <w:r>
-              <w:rPr>
-                <w:rFonts w:ascii="Calibri" w:cs="Calibri" w:eastAsia="Calibri" w:hAnsi="Calibri"/>
-              </w:rPr>
-              <w:t xml:space="preserve">No interview times in Bookings</w:t>
-            </w:r>
-          </w:p>
-        </w:tc>
-        <w:tc>
-          <w:tcPr>
-            <w:tcW w:type="dxa" w:w="5800"/>
-            <w:tcMar>
-              <w:top w:type="dxa" w:w="70"/>
-              <w:left w:type="dxa" w:w="110"/>
-              <w:bottom w:type="dxa" w:w="70"/>
-              <w:right w:type="dxa" w:w="110"/>
-            </w:tcMar>
-          </w:tcPr>
-          <w:p>
-            <w:r>
-              <w:rPr>
-                <w:rFonts w:ascii="Calibri" w:cs="Calibri" w:eastAsia="Calibri" w:hAnsi="Calibri"/>
-              </w:rPr>
-              <w:t xml:space="preserve">Check the role filter, then ask whoever manages Settings to reconnect Google Calendar.</w:t>
-            </w:r>
-          </w:p>
-        </w:tc>
-      </w:tr>
-    </w:tbl>
-    <w:p>
-      <w:pPr>
-        <w:spacing w:after="60"/>
-      </w:pPr>
+        <w:t xml:space="preserve">Need help?</w:t>
+      </w:r>
     </w:p>
     <w:p>
       <w:pPr>
@@ -2646,7 +2396,7 @@
         <w:rPr>
           <w:rFonts w:ascii="Calibri" w:cs="Calibri" w:eastAsia="Calibri" w:hAnsi="Calibri"/>
         </w:rPr>
-        <w:t xml:space="preserve">Still stuck? Ask </w:t>
+        <w:t xml:space="preserve">Ask </w:t>
       </w:r>
       <w:r>
         <w:rPr>

</xml_diff>